<commit_message>
docs: bring every report copy in line with the shipped v2 model
docs/final-report.md still described the old 11-class model (61.34% on
5,220 images, 15 tests), which contradicted the repo next to it. Rewrite it
from the current report, add the architecture, data-source, advice-review
and future-work sections to the DOCX, raise the test count to 39, and state
the upload limit once and clearly: 5 MB in the app, 4 MB on Vercel where
request bodies are capped.
</commit_message>
<xml_diff>
--- a/docs/Final_Report.docx
+++ b/docs/Final_Report.docx
@@ -149,7 +149,7 @@
           <w:b w:val="0"/>
           <w:i w:val="0"/>
         </w:rPr>
-        <w:t>The original plan was a separate backend host plus Vercel for the frontend. Because the ONNX model is small, the whole system now runs as one Vercel project: a Next.js service and a Python serverless function (api/index.py) that mounts the FastAPI backend under /api/*. This gives one account, one URL and no CORS configuration. Trade-offs: scan history lives in SQLite under /tmp and resets on redeploy, uploads are capped at 5 MB by the app, and a cold start after idle adds a few seconds.</w:t>
+        <w:t>The original plan was a separate backend host plus Vercel for the frontend. Because the ONNX model is small, the whole system now runs as one Vercel project: a Next.js service and a Python serverless function (api/index.py) that mounts the FastAPI backend under /api/*. This gives one account, one URL and no CORS configuration. Trade-offs: scan history lives in SQLite under /tmp and resets on redeploy, uploads are capped at 4 MB on that deployment, because Vercel limits request bodies to about 4.5 MB, and a cold start after idle adds a few seconds.</w:t>
       </w:r>
     </w:p>
     <w:p>
@@ -769,7 +769,7 @@
         <w:pStyle w:val="ListBullet"/>
       </w:pPr>
       <w:r>
-        <w:t>Backend test suite: 33 pytest tests, run in GitHub Actions on every push to main.</w:t>
+        <w:t>Backend test suite: 39 pytest tests, run in GitHub Actions on every push to main.</w:t>
       </w:r>
     </w:p>
     <w:p>
@@ -833,7 +833,7 @@
         <w:pStyle w:val="ListBullet"/>
       </w:pPr>
       <w:r>
-        <w:t>Uploads are limited to 5 MB. The LLM advice layer is off by default.</w:t>
+        <w:t>Uploads are limited to 5 MB by the app, and 4 MB on the Vercel deployment because the platform caps request bodies at about 4.5 MB. The LLM advice layer is off by default.</w:t>
       </w:r>
     </w:p>
     <w:p>
@@ -874,6 +874,146 @@
       </w:pPr>
       <w:r>
         <w:t>Measurement changed decisions: the threshold was set from validation data, the gate was retrained after the before/after study showed junk leaking through, and a double-softmax bug was found and fixed.</w:t>
+      </w:r>
+    </w:p>
+    <w:p>
+      <w:pPr>
+        <w:pStyle w:val="Heading1"/>
+      </w:pPr>
+      <w:r>
+        <w:t>7. System Architecture</w:t>
+      </w:r>
+    </w:p>
+    <w:p>
+      <w:r>
+        <w:t>A farmer's photo goes through these steps:</w:t>
+      </w:r>
+    </w:p>
+    <w:p>
+      <w:pPr>
+        <w:pStyle w:val="ListNumber"/>
+      </w:pPr>
+      <w:r>
+        <w:t>Upload and validation: the file must be JPG or PNG, at most 5 MB, and at least 64x64 pixels.</w:t>
+      </w:r>
+    </w:p>
+    <w:p>
+      <w:pPr>
+        <w:pStyle w:val="ListNumber"/>
+      </w:pPr>
+      <w:r>
+        <w:t>Plant gate: a trained classifier decides whether the photo shows a plant leaf. Non-leaf photos get a clear Bangla message and no diagnosis.</w:t>
+      </w:r>
+    </w:p>
+    <w:p>
+      <w:pPr>
+        <w:pStyle w:val="ListNumber"/>
+      </w:pPr>
+      <w:r>
+        <w:t>Photo-quality check: blurry or very dark photos still get a diagnosis, with a Bangla tip to retake the photo.</w:t>
+      </w:r>
+    </w:p>
+    <w:p>
+      <w:pPr>
+        <w:pStyle w:val="ListNumber"/>
+      </w:pPr>
+      <w:r>
+        <w:t>Preprocessing: resize to 224x224, apply EXIF rotation, and scale to [-1, +1], matching training.</w:t>
+      </w:r>
+    </w:p>
+    <w:p>
+      <w:pPr>
+        <w:pStyle w:val="ListNumber"/>
+      </w:pPr>
+      <w:r>
+        <w:t>ONNX inference on the CPU, producing class probabilities.</w:t>
+      </w:r>
+    </w:p>
+    <w:p>
+      <w:pPr>
+        <w:pStyle w:val="ListNumber"/>
+      </w:pPr>
+      <w:r>
+        <w:t>Calibrated threshold (0.30): above it, the app returns the diagnosis with Bangla advice. Below it, the app shows the uncertain screen with the best-guess advice labelled low-confidence and a note to consult the agriculture officer.</w:t>
+      </w:r>
+    </w:p>
+    <w:p>
+      <w:pPr>
+        <w:pStyle w:val="ListNumber"/>
+      </w:pPr>
+      <w:r>
+        <w:t>Response: the scan is saved to history, and the JSON response returns.</w:t>
+      </w:r>
+    </w:p>
+    <w:p>
+      <w:r>
+        <w:t>The frontend is a Next.js app and the backend is a FastAPI app, both deployed on one Vercel project under the same origin.</w:t>
+      </w:r>
+    </w:p>
+    <w:p>
+      <w:pPr>
+        <w:pStyle w:val="Heading1"/>
+      </w:pPr>
+      <w:r>
+        <w:t>8. Data Sources</w:t>
+      </w:r>
+    </w:p>
+    <w:p>
+      <w:r>
+        <w:t>The training data comes from 11 public datasets, merged into canonical class folders with a stratified 70/15/15 split (seed 42): PlantVillage (potato, tomato, maize, grape), a rice leaf disease dataset including tungro, RiceLeafBD (field photos from Bangladesh), a chilli leaf disease dataset from Bangladesh, a Tanzanian maize dataset, the NGLD grape dataset, a Bangladeshi cauliflower dataset, a cucumber disease dataset, BDPapayaLeaf, MangoLeafBD and an Okra disease dataset. Each source's licence is recorded in ml/DATASETS.md. Some licences are non-commercial only, so this project is suitable for research and education, and a commercial product would need permission or different data.</w:t>
+      </w:r>
+    </w:p>
+    <w:p>
+      <w:pPr>
+        <w:pStyle w:val="Heading1"/>
+      </w:pPr>
+      <w:r>
+        <w:t>9. Advice Review</w:t>
+      </w:r>
+    </w:p>
+    <w:p>
+      <w:r>
+        <w:t>The Bangla treatment advice is stored in backend/app/data/guidelines_bn.json. Of the 61 entries, 11 were reviewed by an agriculture officer. The other 50 were written carefully but are still marked as drafts in the data file, until a Bangla agriculture officer verifies them. Pesticide names and doses must be checked against local regulations before commercial use.</w:t>
+      </w:r>
+    </w:p>
+    <w:p>
+      <w:pPr>
+        <w:pStyle w:val="Heading1"/>
+      </w:pPr>
+      <w:r>
+        <w:t>10. Future Work</w:t>
+      </w:r>
+    </w:p>
+    <w:p>
+      <w:pPr>
+        <w:pStyle w:val="ListBullet"/>
+      </w:pPr>
+      <w:r>
+        <w:t>Collect 50 to 100 real field photos per class, retrain with --merge-sources, and check the 50 draft advice entries with an agriculture officer.</w:t>
+      </w:r>
+    </w:p>
+    <w:p>
+      <w:pPr>
+        <w:pStyle w:val="ListBullet"/>
+      </w:pPr>
+      <w:r>
+        <w:t>Add eggplant (brinjal), the first unsupported crop, using the dataset candidates in ml/src/download_data.md.</w:t>
+      </w:r>
+    </w:p>
+    <w:p>
+      <w:pPr>
+        <w:pStyle w:val="ListBullet"/>
+      </w:pPr>
+      <w:r>
+        <w:t>Consider an opt-in feature to store anonymised upload thumbnails, to build a real Bangladeshi field dataset over time.</w:t>
+      </w:r>
+    </w:p>
+    <w:p>
+      <w:pPr>
+        <w:pStyle w:val="ListBullet"/>
+      </w:pPr>
+      <w:r>
+        <w:t>Move scan history to a persistent database, since the current /tmp store resets on redeploy.</w:t>
       </w:r>
     </w:p>
     <w:sectPr>

</xml_diff>

<commit_message>
docs(report): add UI screenshots to the final report
Adds a User Interface section with the home screen and the honest
uncertainty screen, captioned, to both the DOCX and the markdown copy.
</commit_message>
<xml_diff>
--- a/docs/Final_Report.docx
+++ b/docs/Final_Report.docx
@@ -1016,6 +1016,119 @@
         <w:t>Move scan history to a persistent database, since the current /tmp store resets on redeploy.</w:t>
       </w:r>
     </w:p>
+    <w:p>
+      <w:pPr>
+        <w:pStyle w:val="Heading1"/>
+      </w:pPr>
+      <w:r>
+        <w:t>11. User Interface</w:t>
+      </w:r>
+    </w:p>
+    <w:p>
+      <w:r>
+        <w:t>Screenshots of the deployed app (ai-crop-disease-detector-for-bangla-three.vercel.app), taken in a browser at phone-friendly width.</w:t>
+      </w:r>
+    </w:p>
+    <w:p>
+      <w:pPr>
+        <w:jc w:val="center"/>
+      </w:pPr>
+      <w:r>
+        <w:drawing>
+          <wp:inline xmlns:a="http://schemas.openxmlformats.org/drawingml/2006/main" xmlns:pic="http://schemas.openxmlformats.org/drawingml/2006/picture">
+            <wp:extent cx="5400000" cy="3375000"/>
+            <wp:docPr id="1" name="Picture 1"/>
+            <wp:cNvGraphicFramePr>
+              <a:graphicFrameLocks noChangeAspect="1"/>
+            </wp:cNvGraphicFramePr>
+            <a:graphic>
+              <a:graphicData uri="http://schemas.openxmlformats.org/drawingml/2006/picture">
+                <pic:pic>
+                  <pic:nvPicPr>
+                    <pic:cNvPr id="0" name="upload_screen.png"/>
+                    <pic:cNvPicPr/>
+                  </pic:nvPicPr>
+                  <pic:blipFill>
+                    <a:blip r:embed="rId9"/>
+                    <a:stretch>
+                      <a:fillRect/>
+                    </a:stretch>
+                  </pic:blipFill>
+                  <pic:spPr>
+                    <a:xfrm>
+                      <a:off x="0" y="0"/>
+                      <a:ext cx="5400000" cy="3375000"/>
+                    </a:xfrm>
+                    <a:prstGeom prst="rect"/>
+                  </pic:spPr>
+                </pic:pic>
+              </a:graphicData>
+            </a:graphic>
+          </wp:inline>
+        </w:drawing>
+      </w:r>
+    </w:p>
+    <w:p>
+      <w:pPr>
+        <w:jc w:val="center"/>
+      </w:pPr>
+      <w:r>
+        <w:rPr>
+          <w:i/>
+        </w:rPr>
+        <w:t>Figure 1 — Home screen: the farmer takes or selects a leaf photo, then presses 'রোগ নির্ণয় করুন' (diagnose).</w:t>
+      </w:r>
+    </w:p>
+    <w:p>
+      <w:pPr>
+        <w:jc w:val="center"/>
+      </w:pPr>
+      <w:r>
+        <w:drawing>
+          <wp:inline xmlns:a="http://schemas.openxmlformats.org/drawingml/2006/main" xmlns:pic="http://schemas.openxmlformats.org/drawingml/2006/picture">
+            <wp:extent cx="5400000" cy="3375000"/>
+            <wp:docPr id="2" name="Picture 2"/>
+            <wp:cNvGraphicFramePr>
+              <a:graphicFrameLocks noChangeAspect="1"/>
+            </wp:cNvGraphicFramePr>
+            <a:graphic>
+              <a:graphicData uri="http://schemas.openxmlformats.org/drawingml/2006/picture">
+                <pic:pic>
+                  <pic:nvPicPr>
+                    <pic:cNvPr id="0" name="result_uncertain.png"/>
+                    <pic:cNvPicPr/>
+                  </pic:nvPicPr>
+                  <pic:blipFill>
+                    <a:blip r:embed="rId10"/>
+                    <a:stretch>
+                      <a:fillRect/>
+                    </a:stretch>
+                  </pic:blipFill>
+                  <pic:spPr>
+                    <a:xfrm>
+                      <a:off x="0" y="0"/>
+                      <a:ext cx="5400000" cy="3375000"/>
+                    </a:xfrm>
+                    <a:prstGeom prst="rect"/>
+                  </pic:spPr>
+                </pic:pic>
+              </a:graphicData>
+            </a:graphic>
+          </wp:inline>
+        </w:drawing>
+      </w:r>
+    </w:p>
+    <w:p>
+      <w:pPr>
+        <w:jc w:val="center"/>
+      </w:pPr>
+      <w:r>
+        <w:rPr>
+          <w:i/>
+        </w:rPr>
+        <w:t>Figure 2 — Honest uncertainty: below the confidence threshold the app shows 'নিশ্চিত বলা যাচ্ছে না' (cannot confirm), still offers the most probable condition's Bangla advice labelled low-confidence, and asks the farmer to consult an agriculture officer.</w:t>
+      </w:r>
+    </w:p>
     <w:sectPr>
       <w:pgSz w:w="12240" w:h="15840"/>
       <w:pgMar w:top="1440" w:right="1800" w:bottom="1440" w:left="1800" w:header="720" w:footer="720" w:gutter="0"/>

</xml_diff>